<commit_message>
docs: update team name to Jadi H-1 across proposal docx, pdf export, script, and checklist
</commit_message>
<xml_diff>
--- a/docs/Proposal_KilasTugasFIKS.docx
+++ b/docs/Proposal_KilasTugasFIKS.docx
@@ -463,22 +463,12 @@
           <w:bCs/>
           <w:lang w:val="sv-SE"/>
         </w:rPr>
-        <w:t xml:space="preserve">: Tim </w:t>
-      </w:r>
-      <w:proofErr w:type="spellStart"/>
-      <w:r>
-        <w:rPr>
-          <w:b/>
-          <w:bCs/>
-          <w:lang w:val="sv-SE"/>
-        </w:rPr>
-        <w:t>KilasTugas</w:t>
-      </w:r>
-      <w:proofErr w:type="spellEnd"/>
+        <w:t>:</w:t>
+      </w:r>
     </w:p>
     <w:p>
       <w:pPr>
-        <w:spacing w:after="40"/>
+        <w:spacing w:after="40" w:line="276" w:lineRule="auto"/>
         <w:jc w:val="center"/>
         <w:rPr>
           <w:lang w:val="sv-SE"/>
@@ -515,76 +505,36 @@
     </w:p>
     <w:p>
       <w:pPr>
-        <w:spacing w:after="40"/>
+        <w:spacing w:after="40" w:line="276" w:lineRule="auto"/>
         <w:jc w:val="center"/>
-        <w:rPr>
-          <w:lang w:val="sv-SE"/>
-        </w:rPr>
       </w:pPr>
       <w:proofErr w:type="spellStart"/>
       <w:r>
-        <w:rPr>
-          <w:lang w:val="sv-SE"/>
-        </w:rPr>
         <w:t>Timotius</w:t>
       </w:r>
       <w:proofErr w:type="spellEnd"/>
       <w:r>
-        <w:rPr>
-          <w:lang w:val="sv-SE"/>
-        </w:rPr>
         <w:t xml:space="preserve"> Willy Narendra</w:t>
       </w:r>
     </w:p>
     <w:p>
       <w:pPr>
+        <w:spacing w:line="276" w:lineRule="auto"/>
         <w:jc w:val="center"/>
-        <w:rPr>
-          <w:lang w:val="sv-SE"/>
-        </w:rPr>
       </w:pPr>
       <w:proofErr w:type="spellStart"/>
       <w:r>
-        <w:rPr>
-          <w:lang w:val="sv-SE"/>
-        </w:rPr>
         <w:t>Fardizza</w:t>
       </w:r>
       <w:proofErr w:type="spellEnd"/>
       <w:r>
-        <w:rPr>
-          <w:lang w:val="sv-SE"/>
-        </w:rPr>
-        <w:t xml:space="preserve"> </w:t>
-      </w:r>
-      <w:proofErr w:type="spellStart"/>
-      <w:r>
-        <w:rPr>
-          <w:lang w:val="sv-SE"/>
-        </w:rPr>
-        <w:t>Finda</w:t>
-      </w:r>
-      <w:proofErr w:type="spellEnd"/>
-      <w:r>
-        <w:rPr>
-          <w:lang w:val="sv-SE"/>
-        </w:rPr>
-        <w:t xml:space="preserve"> Rahman</w:t>
+        <w:t xml:space="preserve"> Finda Rahman</w:t>
       </w:r>
     </w:p>
-    <w:p>
-      <w:pPr>
-        <w:rPr>
-          <w:lang w:val="sv-SE"/>
-        </w:rPr>
-      </w:pPr>
-    </w:p>
+    <w:p/>
     <w:p>
       <w:pPr>
         <w:jc w:val="center"/>
-        <w:rPr>
-          <w:lang w:val="sv-SE"/>
-        </w:rPr>
       </w:pPr>
     </w:p>
     <w:p>
@@ -859,17 +809,29 @@
                 <w:sz w:val="20"/>
                 <w:szCs w:val="20"/>
               </w:rPr>
-              <w:t xml:space="preserve">Tim </w:t>
-            </w:r>
-            <w:proofErr w:type="spellStart"/>
-            <w:r>
-              <w:rPr>
-                <w:sz w:val="20"/>
-                <w:szCs w:val="20"/>
-              </w:rPr>
-              <w:t>KilasTugas</w:t>
-            </w:r>
-            <w:proofErr w:type="spellEnd"/>
+              <w:t>J</w:t>
+            </w:r>
+            <w:r>
+              <w:rPr>
+                <w:sz w:val="20"/>
+                <w:szCs w:val="20"/>
+              </w:rPr>
+              <w:t>adi</w:t>
+            </w:r>
+            <w:r>
+              <w:rPr>
+                <w:sz w:val="20"/>
+                <w:szCs w:val="20"/>
+              </w:rPr>
+              <w:t xml:space="preserve"> </w:t>
+            </w:r>
+            <w:r>
+              <w:rPr>
+                <w:sz w:val="20"/>
+                <w:szCs w:val="20"/>
+              </w:rPr>
+              <w:t>H-1</w:t>
+            </w:r>
           </w:p>
         </w:tc>
       </w:tr>

</xml_diff>

<commit_message>
docs: sync updated proposal docx and pdf export
</commit_message>
<xml_diff>
--- a/docs/Proposal_KilasTugasFIKS.docx
+++ b/docs/Proposal_KilasTugasFIKS.docx
@@ -426,7 +426,6 @@
         <w:rPr>
           <w:b/>
           <w:bCs/>
-          <w:lang w:val="sv-SE"/>
         </w:rPr>
       </w:pPr>
       <w:proofErr w:type="spellStart"/>
@@ -434,7 +433,6 @@
         <w:rPr>
           <w:b/>
           <w:bCs/>
-          <w:lang w:val="sv-SE"/>
         </w:rPr>
         <w:t>Disusun</w:t>
       </w:r>
@@ -443,64 +441,8 @@
         <w:rPr>
           <w:b/>
           <w:bCs/>
-          <w:lang w:val="sv-SE"/>
-        </w:rPr>
-        <w:t xml:space="preserve"> </w:t>
-      </w:r>
-      <w:proofErr w:type="spellStart"/>
-      <w:r>
-        <w:rPr>
-          <w:b/>
-          <w:bCs/>
-          <w:lang w:val="sv-SE"/>
-        </w:rPr>
-        <w:t>oleh</w:t>
-      </w:r>
-      <w:proofErr w:type="spellEnd"/>
-      <w:r>
-        <w:rPr>
-          <w:b/>
-          <w:bCs/>
-          <w:lang w:val="sv-SE"/>
-        </w:rPr>
-        <w:t>:</w:t>
-      </w:r>
-    </w:p>
-    <w:p>
-      <w:pPr>
-        <w:spacing w:after="40" w:line="276" w:lineRule="auto"/>
-        <w:jc w:val="center"/>
-        <w:rPr>
-          <w:lang w:val="sv-SE"/>
-        </w:rPr>
-      </w:pPr>
-      <w:proofErr w:type="spellStart"/>
-      <w:r>
-        <w:rPr>
-          <w:lang w:val="sv-SE"/>
-        </w:rPr>
-        <w:t>Adridinan</w:t>
-      </w:r>
-      <w:proofErr w:type="spellEnd"/>
-      <w:r>
-        <w:rPr>
-          <w:lang w:val="sv-SE"/>
-        </w:rPr>
-        <w:t xml:space="preserve"> Najmi Faza (</w:t>
-      </w:r>
-      <w:proofErr w:type="spellStart"/>
-      <w:r>
-        <w:rPr>
-          <w:lang w:val="sv-SE"/>
-        </w:rPr>
-        <w:t>Ketua</w:t>
-      </w:r>
-      <w:proofErr w:type="spellEnd"/>
-      <w:r>
-        <w:rPr>
-          <w:lang w:val="sv-SE"/>
-        </w:rPr>
-        <w:t xml:space="preserve"> Tim)</w:t>
+        </w:rPr>
+        <w:t xml:space="preserve"> oleh:</w:t>
       </w:r>
     </w:p>
     <w:p>
@@ -510,6 +452,28 @@
       </w:pPr>
       <w:proofErr w:type="spellStart"/>
       <w:r>
+        <w:t>Adridinan</w:t>
+      </w:r>
+      <w:proofErr w:type="spellEnd"/>
+      <w:r>
+        <w:t xml:space="preserve"> Najmi Faza (</w:t>
+      </w:r>
+      <w:proofErr w:type="spellStart"/>
+      <w:r>
+        <w:t>Ketua</w:t>
+      </w:r>
+      <w:proofErr w:type="spellEnd"/>
+      <w:r>
+        <w:t xml:space="preserve"> Tim)</w:t>
+      </w:r>
+    </w:p>
+    <w:p>
+      <w:pPr>
+        <w:spacing w:after="40" w:line="276" w:lineRule="auto"/>
+        <w:jc w:val="center"/>
+      </w:pPr>
+      <w:proofErr w:type="spellStart"/>
+      <w:r>
         <w:t>Timotius</w:t>
       </w:r>
       <w:proofErr w:type="spellEnd"/>
@@ -521,20 +485,52 @@
       <w:pPr>
         <w:spacing w:line="276" w:lineRule="auto"/>
         <w:jc w:val="center"/>
+        <w:rPr>
+          <w:lang w:val="sv-SE"/>
+        </w:rPr>
       </w:pPr>
       <w:proofErr w:type="spellStart"/>
       <w:r>
+        <w:rPr>
+          <w:lang w:val="sv-SE"/>
+        </w:rPr>
         <w:t>Fardizza</w:t>
       </w:r>
       <w:proofErr w:type="spellEnd"/>
       <w:r>
-        <w:t xml:space="preserve"> Finda Rahman</w:t>
+        <w:rPr>
+          <w:lang w:val="sv-SE"/>
+        </w:rPr>
+        <w:t xml:space="preserve"> </w:t>
+      </w:r>
+      <w:proofErr w:type="spellStart"/>
+      <w:r>
+        <w:rPr>
+          <w:lang w:val="sv-SE"/>
+        </w:rPr>
+        <w:t>Finda</w:t>
+      </w:r>
+      <w:proofErr w:type="spellEnd"/>
+      <w:r>
+        <w:rPr>
+          <w:lang w:val="sv-SE"/>
+        </w:rPr>
+        <w:t xml:space="preserve"> Rahman</w:t>
       </w:r>
     </w:p>
-    <w:p/>
+    <w:p>
+      <w:pPr>
+        <w:rPr>
+          <w:lang w:val="sv-SE"/>
+        </w:rPr>
+      </w:pPr>
+    </w:p>
     <w:p>
       <w:pPr>
         <w:jc w:val="center"/>
+        <w:rPr>
+          <w:lang w:val="sv-SE"/>
+        </w:rPr>
       </w:pPr>
     </w:p>
     <w:p>
@@ -1463,17 +1459,14 @@
             <w:vAlign w:val="center"/>
           </w:tcPr>
           <w:p>
-            <w:proofErr w:type="spellStart"/>
-            <w:r>
+            <w:pPr>
               <w:rPr>
                 <w:b/>
                 <w:bCs/>
                 <w:sz w:val="20"/>
                 <w:szCs w:val="20"/>
               </w:rPr>
-              <w:t>Tautan</w:t>
-            </w:r>
-            <w:proofErr w:type="spellEnd"/>
+            </w:pPr>
             <w:r>
               <w:rPr>
                 <w:b/>
@@ -1481,27 +1474,7 @@
                 <w:sz w:val="20"/>
                 <w:szCs w:val="20"/>
               </w:rPr>
-              <w:t xml:space="preserve"> </w:t>
-            </w:r>
-            <w:proofErr w:type="spellStart"/>
-            <w:r>
-              <w:rPr>
-                <w:b/>
-                <w:bCs/>
-                <w:sz w:val="20"/>
-                <w:szCs w:val="20"/>
-              </w:rPr>
-              <w:t>Repositori</w:t>
-            </w:r>
-            <w:proofErr w:type="spellEnd"/>
-            <w:r>
-              <w:rPr>
-                <w:b/>
-                <w:bCs/>
-                <w:sz w:val="20"/>
-                <w:szCs w:val="20"/>
-              </w:rPr>
-              <w:t xml:space="preserve"> </w:t>
+              <w:t>Video Demo</w:t>
             </w:r>
           </w:p>
         </w:tc>
@@ -1523,12 +1496,140 @@
             <w:vAlign w:val="center"/>
           </w:tcPr>
           <w:p>
-            <w:r>
-              <w:rPr>
-                <w:sz w:val="20"/>
-                <w:szCs w:val="20"/>
-              </w:rPr>
-              <w:t xml:space="preserve">https://github.com/najmifaza/KilasTugas_SIFest_KmHarkatNegri_JadiH-1 </w:t>
+            <w:pPr>
+              <w:rPr>
+                <w:sz w:val="20"/>
+                <w:szCs w:val="20"/>
+              </w:rPr>
+            </w:pPr>
+            <w:hyperlink r:id="rId10" w:history="1">
+              <w:r>
+                <w:rPr>
+                  <w:rStyle w:val="Hyperlink"/>
+                  <w:sz w:val="20"/>
+                  <w:szCs w:val="20"/>
+                </w:rPr>
+                <w:t>https://unsoed.link/JadiH</w:t>
+              </w:r>
+              <w:r>
+                <w:rPr>
+                  <w:rStyle w:val="Hyperlink"/>
+                  <w:sz w:val="20"/>
+                  <w:szCs w:val="20"/>
+                </w:rPr>
+                <w:t>-</w:t>
+              </w:r>
+              <w:r>
+                <w:rPr>
+                  <w:rStyle w:val="Hyperlink"/>
+                  <w:sz w:val="20"/>
+                  <w:szCs w:val="20"/>
+                </w:rPr>
+                <w:t>1-KilasTugas-VideoDemo</w:t>
+              </w:r>
+            </w:hyperlink>
+          </w:p>
+        </w:tc>
+      </w:tr>
+      <w:tr>
+        <w:trPr>
+          <w:cantSplit/>
+          <w:jc w:val="center"/>
+        </w:trPr>
+        <w:tc>
+          <w:tcPr>
+            <w:tcW w:w="2400" w:type="dxa"/>
+            <w:tcBorders>
+              <w:top w:val="single" w:sz="6" w:space="0" w:color="000000"/>
+              <w:left w:val="single" w:sz="6" w:space="0" w:color="000000"/>
+              <w:bottom w:val="single" w:sz="6" w:space="0" w:color="000000"/>
+              <w:right w:val="single" w:sz="6" w:space="0" w:color="000000"/>
+            </w:tcBorders>
+            <w:tcMar>
+              <w:top w:w="60" w:type="dxa"/>
+              <w:left w:w="100" w:type="dxa"/>
+              <w:bottom w:w="60" w:type="dxa"/>
+              <w:right w:w="100" w:type="dxa"/>
+            </w:tcMar>
+            <w:vAlign w:val="center"/>
+          </w:tcPr>
+          <w:p>
+            <w:proofErr w:type="spellStart"/>
+            <w:r>
+              <w:rPr>
+                <w:b/>
+                <w:bCs/>
+                <w:sz w:val="20"/>
+                <w:szCs w:val="20"/>
+              </w:rPr>
+              <w:t>Tautan</w:t>
+            </w:r>
+            <w:proofErr w:type="spellEnd"/>
+            <w:r>
+              <w:rPr>
+                <w:b/>
+                <w:bCs/>
+                <w:sz w:val="20"/>
+                <w:szCs w:val="20"/>
+              </w:rPr>
+              <w:t xml:space="preserve"> </w:t>
+            </w:r>
+            <w:proofErr w:type="spellStart"/>
+            <w:r>
+              <w:rPr>
+                <w:b/>
+                <w:bCs/>
+                <w:sz w:val="20"/>
+                <w:szCs w:val="20"/>
+              </w:rPr>
+              <w:t>Repositori</w:t>
+            </w:r>
+            <w:proofErr w:type="spellEnd"/>
+            <w:r>
+              <w:rPr>
+                <w:b/>
+                <w:bCs/>
+                <w:sz w:val="20"/>
+                <w:szCs w:val="20"/>
+              </w:rPr>
+              <w:t xml:space="preserve"> </w:t>
+            </w:r>
+          </w:p>
+        </w:tc>
+        <w:tc>
+          <w:tcPr>
+            <w:tcW w:w="6387" w:type="dxa"/>
+            <w:tcBorders>
+              <w:top w:val="single" w:sz="6" w:space="0" w:color="000000"/>
+              <w:left w:val="single" w:sz="6" w:space="0" w:color="000000"/>
+              <w:bottom w:val="single" w:sz="6" w:space="0" w:color="000000"/>
+              <w:right w:val="single" w:sz="6" w:space="0" w:color="000000"/>
+            </w:tcBorders>
+            <w:tcMar>
+              <w:top w:w="60" w:type="dxa"/>
+              <w:left w:w="100" w:type="dxa"/>
+              <w:bottom w:w="60" w:type="dxa"/>
+              <w:right w:w="100" w:type="dxa"/>
+            </w:tcMar>
+            <w:vAlign w:val="center"/>
+          </w:tcPr>
+          <w:p>
+            <w:hyperlink r:id="rId11" w:history="1">
+              <w:r>
+                <w:rPr>
+                  <w:rStyle w:val="Hyperlink"/>
+                  <w:sz w:val="20"/>
+                  <w:szCs w:val="20"/>
+                </w:rPr>
+                <w:t>https://github.com/najmifaza/KilasTugas_SIFest_KmHarkatNegri_JadiH-1</w:t>
+              </w:r>
+            </w:hyperlink>
+            <w:r>
+              <w:rPr>
+                <w:sz w:val="20"/>
+                <w:szCs w:val="20"/>
+              </w:rPr>
+              <w:t xml:space="preserve"> </w:t>
             </w:r>
           </w:p>
         </w:tc>
@@ -1556,6 +1657,12 @@
         </w:rPr>
         <w:t>1. RINGKASAN MASALAH</w:t>
       </w:r>
+      <w:r>
+        <w:rPr>
+          <w:lang w:val="sv-SE"/>
+        </w:rPr>
+        <w:tab/>
+      </w:r>
     </w:p>
     <w:p>
       <w:pPr>
@@ -5341,28 +5448,49 @@
         <w:pStyle w:val="Heading2"/>
         <w:keepNext/>
         <w:spacing w:line="276" w:lineRule="auto"/>
+        <w:rPr>
+          <w:lang w:val="sv-SE"/>
+        </w:rPr>
       </w:pPr>
       <w:r>
+        <w:rPr>
+          <w:lang w:val="sv-SE"/>
+        </w:rPr>
         <w:t xml:space="preserve">2.1 </w:t>
       </w:r>
       <w:proofErr w:type="spellStart"/>
       <w:r>
+        <w:rPr>
+          <w:lang w:val="sv-SE"/>
+        </w:rPr>
         <w:t>Literatur</w:t>
       </w:r>
       <w:proofErr w:type="spellEnd"/>
       <w:r>
-        <w:t xml:space="preserve"> </w:t>
-      </w:r>
-      <w:proofErr w:type="spellStart"/>
-      <w:r>
-        <w:t>Akademis</w:t>
-      </w:r>
-      <w:proofErr w:type="spellEnd"/>
-      <w:r>
-        <w:t xml:space="preserve"> &amp; Kajian </w:t>
-      </w:r>
-      <w:proofErr w:type="spellStart"/>
-      <w:r>
+        <w:rPr>
+          <w:lang w:val="sv-SE"/>
+        </w:rPr>
+        <w:t xml:space="preserve"> Akademis &amp; </w:t>
+      </w:r>
+      <w:proofErr w:type="spellStart"/>
+      <w:r>
+        <w:rPr>
+          <w:lang w:val="sv-SE"/>
+        </w:rPr>
+        <w:t>Kajian</w:t>
+      </w:r>
+      <w:proofErr w:type="spellEnd"/>
+      <w:r>
+        <w:rPr>
+          <w:lang w:val="sv-SE"/>
+        </w:rPr>
+        <w:t xml:space="preserve"> </w:t>
+      </w:r>
+      <w:proofErr w:type="spellStart"/>
+      <w:r>
+        <w:rPr>
+          <w:lang w:val="sv-SE"/>
+        </w:rPr>
         <w:t>Ilmiah</w:t>
       </w:r>
       <w:proofErr w:type="spellEnd"/>
@@ -5376,179 +5504,389 @@
         </w:numPr>
         <w:spacing w:after="80" w:line="276" w:lineRule="auto"/>
         <w:jc w:val="both"/>
+        <w:rPr>
+          <w:lang w:val="sv-SE"/>
+        </w:rPr>
       </w:pPr>
       <w:r>
         <w:rPr>
           <w:b/>
           <w:bCs/>
-        </w:rPr>
-        <w:t>American Psychological Association (APA / Onwuegbuzie &amp; Jiao, 2000):</w:t>
-      </w:r>
-      <w:r>
-        <w:t xml:space="preserve"> </w:t>
-      </w:r>
-      <w:proofErr w:type="spellStart"/>
-      <w:r>
-        <w:t>Prokrastinasi</w:t>
-      </w:r>
-      <w:proofErr w:type="spellEnd"/>
-      <w:r>
-        <w:t xml:space="preserve"> </w:t>
-      </w:r>
-      <w:proofErr w:type="spellStart"/>
-      <w:r>
-        <w:t>akademik</w:t>
-      </w:r>
-      <w:proofErr w:type="spellEnd"/>
-      <w:r>
-        <w:t xml:space="preserve"> </w:t>
-      </w:r>
-      <w:proofErr w:type="spellStart"/>
-      <w:r>
-        <w:t>dialami</w:t>
-      </w:r>
-      <w:proofErr w:type="spellEnd"/>
-      <w:r>
-        <w:t xml:space="preserve"> oleh </w:t>
-      </w:r>
+          <w:lang w:val="sv-SE"/>
+        </w:rPr>
+        <w:t xml:space="preserve">Steel (2007), </w:t>
+      </w:r>
+      <w:proofErr w:type="spellStart"/>
       <w:r>
         <w:rPr>
           <w:b/>
           <w:bCs/>
-        </w:rPr>
-        <w:t xml:space="preserve">80%–95% </w:t>
-      </w:r>
-      <w:proofErr w:type="spellStart"/>
+          <w:i/>
+          <w:iCs/>
+          <w:lang w:val="sv-SE"/>
+        </w:rPr>
+        <w:t>Psychological</w:t>
+      </w:r>
+      <w:proofErr w:type="spellEnd"/>
       <w:r>
         <w:rPr>
           <w:b/>
           <w:bCs/>
-        </w:rPr>
-        <w:t>mahasiswa</w:t>
-      </w:r>
-      <w:proofErr w:type="spellEnd"/>
+          <w:i/>
+          <w:iCs/>
+          <w:lang w:val="sv-SE"/>
+        </w:rPr>
+        <w:t xml:space="preserve"> Bulletin</w:t>
+      </w:r>
       <w:r>
         <w:rPr>
           <w:b/>
           <w:bCs/>
-        </w:rPr>
-        <w:t xml:space="preserve"> </w:t>
-      </w:r>
-      <w:proofErr w:type="spellStart"/>
-      <w:r>
-        <w:rPr>
-          <w:b/>
-          <w:bCs/>
-        </w:rPr>
-        <w:t>perguruan</w:t>
-      </w:r>
-      <w:proofErr w:type="spellEnd"/>
-      <w:r>
-        <w:rPr>
-          <w:b/>
-          <w:bCs/>
-        </w:rPr>
-        <w:t xml:space="preserve"> </w:t>
-      </w:r>
-      <w:proofErr w:type="spellStart"/>
-      <w:r>
-        <w:rPr>
-          <w:b/>
-          <w:bCs/>
-        </w:rPr>
-        <w:t>tinggi</w:t>
-      </w:r>
-      <w:proofErr w:type="spellEnd"/>
-      <w:r>
+          <w:lang w:val="sv-SE"/>
+        </w:rPr>
+        <w:t xml:space="preserve"> (APA): </w:t>
+      </w:r>
+      <w:r>
+        <w:rPr>
+          <w:lang w:val="sv-SE"/>
+        </w:rPr>
+        <w:t>Meta-</w:t>
+      </w:r>
+      <w:proofErr w:type="spellStart"/>
+      <w:r>
+        <w:rPr>
+          <w:lang w:val="sv-SE"/>
+        </w:rPr>
+        <w:t>analisis</w:t>
+      </w:r>
+      <w:proofErr w:type="spellEnd"/>
+      <w:r>
+        <w:rPr>
+          <w:lang w:val="sv-SE"/>
+        </w:rPr>
+        <w:t xml:space="preserve"> ini </w:t>
+      </w:r>
+      <w:proofErr w:type="spellStart"/>
+      <w:r>
+        <w:rPr>
+          <w:lang w:val="sv-SE"/>
+        </w:rPr>
+        <w:t>mengkaji</w:t>
+      </w:r>
+      <w:proofErr w:type="spellEnd"/>
+      <w:r>
+        <w:rPr>
+          <w:lang w:val="sv-SE"/>
+        </w:rPr>
+        <w:t xml:space="preserve"> </w:t>
+      </w:r>
+      <w:proofErr w:type="spellStart"/>
+      <w:r>
+        <w:rPr>
+          <w:lang w:val="sv-SE"/>
+        </w:rPr>
+        <w:t>penyebab</w:t>
+      </w:r>
+      <w:proofErr w:type="spellEnd"/>
+      <w:r>
+        <w:rPr>
+          <w:lang w:val="sv-SE"/>
+        </w:rPr>
+        <w:t xml:space="preserve"> </w:t>
+      </w:r>
+      <w:proofErr w:type="spellStart"/>
+      <w:r>
+        <w:rPr>
+          <w:lang w:val="sv-SE"/>
+        </w:rPr>
+        <w:t>prokrastinasi</w:t>
+      </w:r>
+      <w:proofErr w:type="spellEnd"/>
+      <w:r>
+        <w:rPr>
+          <w:lang w:val="sv-SE"/>
+        </w:rPr>
+        <w:t xml:space="preserve"> dan </w:t>
+      </w:r>
+      <w:proofErr w:type="spellStart"/>
+      <w:r>
+        <w:rPr>
+          <w:lang w:val="sv-SE"/>
+        </w:rPr>
+        <w:t>menemukan</w:t>
+      </w:r>
+      <w:proofErr w:type="spellEnd"/>
+      <w:r>
+        <w:rPr>
+          <w:lang w:val="sv-SE"/>
+        </w:rPr>
+        <w:t xml:space="preserve"> prediktor yang </w:t>
+      </w:r>
+      <w:proofErr w:type="spellStart"/>
+      <w:r>
+        <w:rPr>
+          <w:lang w:val="sv-SE"/>
+        </w:rPr>
+        <w:t>kuat</w:t>
+      </w:r>
+      <w:proofErr w:type="spellEnd"/>
+      <w:r>
+        <w:rPr>
+          <w:lang w:val="sv-SE"/>
+        </w:rPr>
+        <w:t xml:space="preserve"> dan </w:t>
+      </w:r>
+      <w:proofErr w:type="spellStart"/>
+      <w:r>
+        <w:rPr>
+          <w:lang w:val="sv-SE"/>
+        </w:rPr>
+        <w:t>konsisten</w:t>
+      </w:r>
+      <w:proofErr w:type="spellEnd"/>
+      <w:r>
+        <w:rPr>
+          <w:lang w:val="sv-SE"/>
+        </w:rPr>
         <w:t xml:space="preserve">, </w:t>
       </w:r>
       <w:proofErr w:type="spellStart"/>
       <w:r>
-        <w:t>dengan</w:t>
-      </w:r>
-      <w:proofErr w:type="spellEnd"/>
-      <w:r>
-        <w:t xml:space="preserve"> 50% di </w:t>
-      </w:r>
-      <w:proofErr w:type="spellStart"/>
-      <w:r>
-        <w:t>antaranya</w:t>
-      </w:r>
-      <w:proofErr w:type="spellEnd"/>
-      <w:r>
-        <w:t xml:space="preserve"> </w:t>
-      </w:r>
-      <w:proofErr w:type="spellStart"/>
-      <w:r>
-        <w:t>melaporkan</w:t>
-      </w:r>
-      <w:proofErr w:type="spellEnd"/>
-      <w:r>
-        <w:t xml:space="preserve"> </w:t>
-      </w:r>
-      <w:proofErr w:type="spellStart"/>
-      <w:r>
+        <w:rPr>
+          <w:lang w:val="sv-SE"/>
+        </w:rPr>
+        <w:t>yaitu</w:t>
+      </w:r>
+      <w:proofErr w:type="spellEnd"/>
+      <w:r>
+        <w:rPr>
+          <w:lang w:val="sv-SE"/>
+        </w:rPr>
+        <w:t xml:space="preserve"> </w:t>
+      </w:r>
+      <w:proofErr w:type="spellStart"/>
+      <w:r>
+        <w:rPr>
+          <w:lang w:val="sv-SE"/>
+        </w:rPr>
+        <w:t>aversivitas</w:t>
+      </w:r>
+      <w:proofErr w:type="spellEnd"/>
+      <w:r>
+        <w:rPr>
+          <w:lang w:val="sv-SE"/>
+        </w:rPr>
+        <w:t xml:space="preserve"> </w:t>
+      </w:r>
+      <w:proofErr w:type="spellStart"/>
+      <w:r>
+        <w:rPr>
+          <w:lang w:val="sv-SE"/>
+        </w:rPr>
+        <w:t>tugas</w:t>
+      </w:r>
+      <w:proofErr w:type="spellEnd"/>
+      <w:r>
+        <w:rPr>
+          <w:lang w:val="sv-SE"/>
+        </w:rPr>
+        <w:t xml:space="preserve">, </w:t>
+      </w:r>
+      <w:proofErr w:type="spellStart"/>
+      <w:r>
+        <w:rPr>
+          <w:lang w:val="sv-SE"/>
+        </w:rPr>
         <w:t>penundaan</w:t>
       </w:r>
       <w:proofErr w:type="spellEnd"/>
       <w:r>
-        <w:t xml:space="preserve"> </w:t>
-      </w:r>
-      <w:proofErr w:type="spellStart"/>
-      <w:r>
-        <w:t>tugas</w:t>
-      </w:r>
-      <w:proofErr w:type="spellEnd"/>
-      <w:r>
-        <w:t xml:space="preserve"> </w:t>
-      </w:r>
-      <w:proofErr w:type="spellStart"/>
-      <w:r>
-        <w:t>berdampak</w:t>
-      </w:r>
-      <w:proofErr w:type="spellEnd"/>
-      <w:r>
-        <w:t xml:space="preserve"> </w:t>
-      </w:r>
-      <w:proofErr w:type="spellStart"/>
-      <w:r>
-        <w:t>destruktif</w:t>
-      </w:r>
-      <w:proofErr w:type="spellEnd"/>
-      <w:r>
-        <w:t xml:space="preserve"> pada </w:t>
-      </w:r>
-      <w:proofErr w:type="spellStart"/>
-      <w:r>
-        <w:t>performa</w:t>
-      </w:r>
-      <w:proofErr w:type="spellEnd"/>
-      <w:r>
-        <w:t xml:space="preserve"> </w:t>
-      </w:r>
-      <w:proofErr w:type="spellStart"/>
-      <w:r>
-        <w:t>indeks</w:t>
-      </w:r>
-      <w:proofErr w:type="spellEnd"/>
-      <w:r>
-        <w:t xml:space="preserve"> </w:t>
-      </w:r>
-      <w:proofErr w:type="spellStart"/>
-      <w:r>
-        <w:t>prestasi</w:t>
-      </w:r>
-      <w:proofErr w:type="spellEnd"/>
-      <w:r>
-        <w:t xml:space="preserve"> dan </w:t>
-      </w:r>
-      <w:proofErr w:type="spellStart"/>
-      <w:r>
-        <w:t>stabilitas</w:t>
-      </w:r>
-      <w:proofErr w:type="spellEnd"/>
-      <w:r>
-        <w:t xml:space="preserve"> mental.</w:t>
+        <w:rPr>
+          <w:lang w:val="sv-SE"/>
+        </w:rPr>
+        <w:t xml:space="preserve">, </w:t>
+      </w:r>
+      <w:proofErr w:type="spellStart"/>
+      <w:r>
+        <w:rPr>
+          <w:lang w:val="sv-SE"/>
+        </w:rPr>
+        <w:t>self-efficacy</w:t>
+      </w:r>
+      <w:proofErr w:type="spellEnd"/>
+      <w:r>
+        <w:rPr>
+          <w:lang w:val="sv-SE"/>
+        </w:rPr>
+        <w:t xml:space="preserve">, </w:t>
+      </w:r>
+      <w:proofErr w:type="spellStart"/>
+      <w:r>
+        <w:rPr>
+          <w:lang w:val="sv-SE"/>
+        </w:rPr>
+        <w:t>impulsivitas</w:t>
+      </w:r>
+      <w:proofErr w:type="spellEnd"/>
+      <w:r>
+        <w:rPr>
+          <w:lang w:val="sv-SE"/>
+        </w:rPr>
+        <w:t xml:space="preserve">, </w:t>
+      </w:r>
+      <w:proofErr w:type="spellStart"/>
+      <w:r>
+        <w:rPr>
+          <w:lang w:val="sv-SE"/>
+        </w:rPr>
+        <w:t>serta</w:t>
+      </w:r>
+      <w:proofErr w:type="spellEnd"/>
+      <w:r>
+        <w:rPr>
+          <w:lang w:val="sv-SE"/>
+        </w:rPr>
+        <w:t xml:space="preserve"> </w:t>
+      </w:r>
+      <w:proofErr w:type="spellStart"/>
+      <w:r>
+        <w:rPr>
+          <w:lang w:val="sv-SE"/>
+        </w:rPr>
+        <w:t>conscientiousness</w:t>
+      </w:r>
+      <w:proofErr w:type="spellEnd"/>
+      <w:r>
+        <w:rPr>
+          <w:lang w:val="sv-SE"/>
+        </w:rPr>
+        <w:t xml:space="preserve">. Steel </w:t>
+      </w:r>
+      <w:proofErr w:type="spellStart"/>
+      <w:r>
+        <w:rPr>
+          <w:lang w:val="sv-SE"/>
+        </w:rPr>
+        <w:t>juga</w:t>
+      </w:r>
+      <w:proofErr w:type="spellEnd"/>
+      <w:r>
+        <w:rPr>
+          <w:lang w:val="sv-SE"/>
+        </w:rPr>
+        <w:t xml:space="preserve"> </w:t>
+      </w:r>
+      <w:proofErr w:type="spellStart"/>
+      <w:r>
+        <w:rPr>
+          <w:lang w:val="sv-SE"/>
+        </w:rPr>
+        <w:t>menjadi</w:t>
+      </w:r>
+      <w:proofErr w:type="spellEnd"/>
+      <w:r>
+        <w:rPr>
+          <w:lang w:val="sv-SE"/>
+        </w:rPr>
+        <w:t xml:space="preserve"> </w:t>
+      </w:r>
+      <w:proofErr w:type="spellStart"/>
+      <w:r>
+        <w:rPr>
+          <w:lang w:val="sv-SE"/>
+        </w:rPr>
+        <w:t>rujukan</w:t>
+      </w:r>
+      <w:proofErr w:type="spellEnd"/>
+      <w:r>
+        <w:rPr>
+          <w:lang w:val="sv-SE"/>
+        </w:rPr>
+        <w:t xml:space="preserve"> </w:t>
+      </w:r>
+      <w:proofErr w:type="spellStart"/>
+      <w:r>
+        <w:rPr>
+          <w:lang w:val="sv-SE"/>
+        </w:rPr>
+        <w:t>untuk</w:t>
+      </w:r>
+      <w:proofErr w:type="spellEnd"/>
+      <w:r>
+        <w:rPr>
+          <w:lang w:val="sv-SE"/>
+        </w:rPr>
+        <w:t xml:space="preserve"> </w:t>
+      </w:r>
+      <w:proofErr w:type="spellStart"/>
+      <w:r>
+        <w:rPr>
+          <w:lang w:val="sv-SE"/>
+        </w:rPr>
+        <w:t>estimasi</w:t>
+      </w:r>
+      <w:proofErr w:type="spellEnd"/>
+      <w:r>
+        <w:rPr>
+          <w:lang w:val="sv-SE"/>
+        </w:rPr>
+        <w:t xml:space="preserve"> </w:t>
+      </w:r>
+      <w:proofErr w:type="spellStart"/>
+      <w:r>
+        <w:rPr>
+          <w:lang w:val="sv-SE"/>
+        </w:rPr>
+        <w:t>bahwa</w:t>
+      </w:r>
+      <w:proofErr w:type="spellEnd"/>
+      <w:r>
+        <w:rPr>
+          <w:lang w:val="sv-SE"/>
+        </w:rPr>
+        <w:t xml:space="preserve"> 80%–95% </w:t>
+      </w:r>
+      <w:proofErr w:type="spellStart"/>
+      <w:r>
+        <w:rPr>
+          <w:lang w:val="sv-SE"/>
+        </w:rPr>
+        <w:t>mahasiswa</w:t>
+      </w:r>
+      <w:proofErr w:type="spellEnd"/>
+      <w:r>
+        <w:rPr>
+          <w:lang w:val="sv-SE"/>
+        </w:rPr>
+        <w:t xml:space="preserve"> </w:t>
+      </w:r>
+      <w:proofErr w:type="spellStart"/>
+      <w:r>
+        <w:rPr>
+          <w:lang w:val="sv-SE"/>
+        </w:rPr>
+        <w:t>melakukan</w:t>
+      </w:r>
+      <w:proofErr w:type="spellEnd"/>
+      <w:r>
+        <w:rPr>
+          <w:lang w:val="sv-SE"/>
+        </w:rPr>
+        <w:t xml:space="preserve"> </w:t>
+      </w:r>
+      <w:proofErr w:type="spellStart"/>
+      <w:r>
+        <w:rPr>
+          <w:lang w:val="sv-SE"/>
+        </w:rPr>
+        <w:t>prokrastinasi</w:t>
+      </w:r>
+      <w:proofErr w:type="spellEnd"/>
+      <w:r>
+        <w:rPr>
+          <w:lang w:val="sv-SE"/>
+        </w:rPr>
+        <w:t>.</w:t>
       </w:r>
     </w:p>
     <w:p>
@@ -5560,172 +5898,593 @@
         </w:numPr>
         <w:spacing w:after="80" w:line="276" w:lineRule="auto"/>
         <w:jc w:val="both"/>
+        <w:rPr>
+          <w:lang w:val="sv-SE"/>
+        </w:rPr>
       </w:pPr>
       <w:r>
         <w:rPr>
           <w:b/>
           <w:bCs/>
-        </w:rPr>
-        <w:t>Journal of Educational Psychology:</w:t>
-      </w:r>
-      <w:r>
-        <w:t xml:space="preserve"> </w:t>
-      </w:r>
-      <w:proofErr w:type="spellStart"/>
-      <w:r>
-        <w:t>Penerapan</w:t>
-      </w:r>
-      <w:proofErr w:type="spellEnd"/>
-      <w:r>
-        <w:t xml:space="preserve"> </w:t>
-      </w:r>
-      <w:proofErr w:type="spellStart"/>
-      <w:r>
-        <w:t>teknik</w:t>
-      </w:r>
-      <w:proofErr w:type="spellEnd"/>
-      <w:r>
-        <w:t xml:space="preserve"> </w:t>
-      </w:r>
-      <w:proofErr w:type="spellStart"/>
-      <w:r>
-        <w:t>pemecahan</w:t>
-      </w:r>
-      <w:proofErr w:type="spellEnd"/>
-      <w:r>
-        <w:t xml:space="preserve"> </w:t>
-      </w:r>
-      <w:proofErr w:type="spellStart"/>
-      <w:r>
-        <w:t>tugas</w:t>
-      </w:r>
-      <w:proofErr w:type="spellEnd"/>
-      <w:r>
-        <w:t xml:space="preserve"> </w:t>
-      </w:r>
-      <w:proofErr w:type="spellStart"/>
-      <w:r>
-        <w:t>bertahap</w:t>
-      </w:r>
-      <w:proofErr w:type="spellEnd"/>
-      <w:r>
-        <w:t xml:space="preserve"> (</w:t>
-      </w:r>
-      <w:r>
-        <w:rPr>
-          <w:i/>
-          <w:iCs/>
-        </w:rPr>
-        <w:t>Task Chunking</w:t>
-      </w:r>
-      <w:r>
-        <w:t xml:space="preserve">) </w:t>
-      </w:r>
-      <w:proofErr w:type="spellStart"/>
-      <w:r>
-        <w:t>terbukti</w:t>
-      </w:r>
-      <w:proofErr w:type="spellEnd"/>
-      <w:r>
-        <w:t xml:space="preserve"> </w:t>
-      </w:r>
-      <w:proofErr w:type="spellStart"/>
-      <w:r>
-        <w:t>meningkatkan</w:t>
-      </w:r>
-      <w:proofErr w:type="spellEnd"/>
-      <w:r>
-        <w:t xml:space="preserve"> </w:t>
-      </w:r>
-      <w:proofErr w:type="spellStart"/>
-      <w:r>
-        <w:t>rasio</w:t>
-      </w:r>
-      <w:proofErr w:type="spellEnd"/>
-      <w:r>
-        <w:t xml:space="preserve"> </w:t>
-      </w:r>
-      <w:proofErr w:type="spellStart"/>
-      <w:r>
-        <w:t>penyelesaian</w:t>
-      </w:r>
-      <w:proofErr w:type="spellEnd"/>
-      <w:r>
-        <w:t xml:space="preserve"> </w:t>
-      </w:r>
-      <w:proofErr w:type="spellStart"/>
-      <w:r>
-        <w:t>tugas</w:t>
-      </w:r>
-      <w:proofErr w:type="spellEnd"/>
-      <w:r>
-        <w:t xml:space="preserve"> </w:t>
-      </w:r>
-      <w:proofErr w:type="spellStart"/>
-      <w:r>
-        <w:t>akademik</w:t>
-      </w:r>
-      <w:proofErr w:type="spellEnd"/>
-      <w:r>
-        <w:t xml:space="preserve"> </w:t>
-      </w:r>
-      <w:proofErr w:type="spellStart"/>
-      <w:r>
-        <w:t>hingga</w:t>
-      </w:r>
-      <w:proofErr w:type="spellEnd"/>
-      <w:r>
-        <w:t xml:space="preserve"> </w:t>
-      </w:r>
+          <w:lang w:val="sv-SE"/>
+        </w:rPr>
+        <w:t xml:space="preserve">Solomon &amp; </w:t>
+      </w:r>
+      <w:proofErr w:type="spellStart"/>
       <w:r>
         <w:rPr>
           <w:b/>
           <w:bCs/>
-        </w:rPr>
-        <w:t>60%</w:t>
-      </w:r>
-      <w:r>
-        <w:t xml:space="preserve"> </w:t>
-      </w:r>
-      <w:proofErr w:type="spellStart"/>
-      <w:r>
-        <w:t>dibandingkan</w:t>
-      </w:r>
-      <w:proofErr w:type="spellEnd"/>
-      <w:r>
-        <w:t xml:space="preserve"> </w:t>
-      </w:r>
-      <w:proofErr w:type="spellStart"/>
-      <w:r>
-        <w:t>pencatatan</w:t>
-      </w:r>
-      <w:proofErr w:type="spellEnd"/>
-      <w:r>
-        <w:t xml:space="preserve"> </w:t>
-      </w:r>
-      <w:proofErr w:type="spellStart"/>
-      <w:r>
-        <w:t>berbasis</w:t>
-      </w:r>
-      <w:proofErr w:type="spellEnd"/>
-      <w:r>
-        <w:t xml:space="preserve"> daftar </w:t>
-      </w:r>
-      <w:proofErr w:type="spellStart"/>
-      <w:r>
+          <w:lang w:val="sv-SE"/>
+        </w:rPr>
+        <w:t>Rothblum</w:t>
+      </w:r>
+      <w:proofErr w:type="spellEnd"/>
+      <w:r>
+        <w:rPr>
+          <w:b/>
+          <w:bCs/>
+          <w:lang w:val="sv-SE"/>
+        </w:rPr>
+        <w:t xml:space="preserve"> (1984), </w:t>
+      </w:r>
+      <w:r>
+        <w:rPr>
+          <w:b/>
+          <w:bCs/>
+          <w:i/>
+          <w:iCs/>
+          <w:lang w:val="sv-SE"/>
+        </w:rPr>
+        <w:t xml:space="preserve">Journal </w:t>
+      </w:r>
+      <w:proofErr w:type="spellStart"/>
+      <w:r>
+        <w:rPr>
+          <w:b/>
+          <w:bCs/>
+          <w:i/>
+          <w:iCs/>
+          <w:lang w:val="sv-SE"/>
+        </w:rPr>
+        <w:t>of</w:t>
+      </w:r>
+      <w:proofErr w:type="spellEnd"/>
+      <w:r>
+        <w:rPr>
+          <w:b/>
+          <w:bCs/>
+          <w:i/>
+          <w:iCs/>
+          <w:lang w:val="sv-SE"/>
+        </w:rPr>
+        <w:t xml:space="preserve"> </w:t>
+      </w:r>
+      <w:proofErr w:type="spellStart"/>
+      <w:r>
+        <w:rPr>
+          <w:b/>
+          <w:bCs/>
+          <w:i/>
+          <w:iCs/>
+          <w:lang w:val="sv-SE"/>
+        </w:rPr>
+        <w:t>Counseling</w:t>
+      </w:r>
+      <w:proofErr w:type="spellEnd"/>
+      <w:r>
+        <w:rPr>
+          <w:b/>
+          <w:bCs/>
+          <w:i/>
+          <w:iCs/>
+          <w:lang w:val="sv-SE"/>
+        </w:rPr>
+        <w:t xml:space="preserve"> </w:t>
+      </w:r>
+      <w:proofErr w:type="spellStart"/>
+      <w:r>
+        <w:rPr>
+          <w:b/>
+          <w:bCs/>
+          <w:i/>
+          <w:iCs/>
+          <w:lang w:val="sv-SE"/>
+        </w:rPr>
+        <w:t>Psychology</w:t>
+      </w:r>
+      <w:proofErr w:type="spellEnd"/>
+      <w:r>
+        <w:rPr>
+          <w:b/>
+          <w:bCs/>
+          <w:lang w:val="sv-SE"/>
+        </w:rPr>
+        <w:t xml:space="preserve">: </w:t>
+      </w:r>
+      <w:proofErr w:type="spellStart"/>
+      <w:r>
+        <w:rPr>
+          <w:lang w:val="sv-SE"/>
+        </w:rPr>
+        <w:t>Studi</w:t>
+      </w:r>
+      <w:proofErr w:type="spellEnd"/>
+      <w:r>
+        <w:rPr>
+          <w:lang w:val="sv-SE"/>
+        </w:rPr>
+        <w:t xml:space="preserve"> </w:t>
+      </w:r>
+      <w:proofErr w:type="spellStart"/>
+      <w:r>
+        <w:rPr>
+          <w:lang w:val="sv-SE"/>
+        </w:rPr>
+        <w:t>terhadap</w:t>
+      </w:r>
+      <w:proofErr w:type="spellEnd"/>
+      <w:r>
+        <w:rPr>
+          <w:lang w:val="sv-SE"/>
+        </w:rPr>
+        <w:t xml:space="preserve"> 342 </w:t>
+      </w:r>
+      <w:proofErr w:type="spellStart"/>
+      <w:r>
+        <w:rPr>
+          <w:lang w:val="sv-SE"/>
+        </w:rPr>
+        <w:t>mahasiswa</w:t>
+      </w:r>
+      <w:proofErr w:type="spellEnd"/>
+      <w:r>
+        <w:rPr>
+          <w:lang w:val="sv-SE"/>
+        </w:rPr>
+        <w:t xml:space="preserve"> ini </w:t>
+      </w:r>
+      <w:proofErr w:type="spellStart"/>
+      <w:r>
+        <w:rPr>
+          <w:lang w:val="sv-SE"/>
+        </w:rPr>
+        <w:t>menemukan</w:t>
+      </w:r>
+      <w:proofErr w:type="spellEnd"/>
+      <w:r>
+        <w:rPr>
+          <w:lang w:val="sv-SE"/>
+        </w:rPr>
+        <w:t xml:space="preserve"> </w:t>
+      </w:r>
+      <w:proofErr w:type="spellStart"/>
+      <w:r>
+        <w:rPr>
+          <w:lang w:val="sv-SE"/>
+        </w:rPr>
+        <w:t>banyak</w:t>
+      </w:r>
+      <w:proofErr w:type="spellEnd"/>
+      <w:r>
+        <w:rPr>
+          <w:lang w:val="sv-SE"/>
+        </w:rPr>
+        <w:t xml:space="preserve"> yang </w:t>
+      </w:r>
+      <w:proofErr w:type="spellStart"/>
+      <w:r>
+        <w:rPr>
+          <w:lang w:val="sv-SE"/>
+        </w:rPr>
+        <w:t>bermasalah</w:t>
+      </w:r>
+      <w:proofErr w:type="spellEnd"/>
+      <w:r>
+        <w:rPr>
+          <w:lang w:val="sv-SE"/>
+        </w:rPr>
+        <w:t xml:space="preserve"> </w:t>
+      </w:r>
+      <w:proofErr w:type="spellStart"/>
+      <w:r>
+        <w:rPr>
+          <w:lang w:val="sv-SE"/>
+        </w:rPr>
+        <w:t>dengan</w:t>
+      </w:r>
+      <w:proofErr w:type="spellEnd"/>
+      <w:r>
+        <w:rPr>
+          <w:lang w:val="sv-SE"/>
+        </w:rPr>
+        <w:t xml:space="preserve"> </w:t>
+      </w:r>
+      <w:proofErr w:type="spellStart"/>
+      <w:r>
+        <w:rPr>
+          <w:lang w:val="sv-SE"/>
+        </w:rPr>
+        <w:t>prokrastinasi</w:t>
+      </w:r>
+      <w:proofErr w:type="spellEnd"/>
+      <w:r>
+        <w:rPr>
+          <w:lang w:val="sv-SE"/>
+        </w:rPr>
+        <w:t xml:space="preserve"> </w:t>
+      </w:r>
+      <w:proofErr w:type="spellStart"/>
+      <w:r>
+        <w:rPr>
+          <w:lang w:val="sv-SE"/>
+        </w:rPr>
+        <w:t>pada</w:t>
+      </w:r>
+      <w:proofErr w:type="spellEnd"/>
+      <w:r>
+        <w:rPr>
+          <w:lang w:val="sv-SE"/>
+        </w:rPr>
+        <w:t xml:space="preserve"> </w:t>
+      </w:r>
+      <w:proofErr w:type="spellStart"/>
+      <w:r>
+        <w:rPr>
+          <w:lang w:val="sv-SE"/>
+        </w:rPr>
+        <w:t>berbagai</w:t>
+      </w:r>
+      <w:proofErr w:type="spellEnd"/>
+      <w:r>
+        <w:rPr>
+          <w:lang w:val="sv-SE"/>
+        </w:rPr>
+        <w:t xml:space="preserve"> </w:t>
+      </w:r>
+      <w:proofErr w:type="spellStart"/>
+      <w:r>
+        <w:rPr>
+          <w:lang w:val="sv-SE"/>
+        </w:rPr>
         <w:t>tugas</w:t>
       </w:r>
       <w:proofErr w:type="spellEnd"/>
       <w:r>
-        <w:t xml:space="preserve"> </w:t>
-      </w:r>
-      <w:proofErr w:type="spellStart"/>
-      <w:r>
-        <w:t>konvensional</w:t>
-      </w:r>
-      <w:proofErr w:type="spellEnd"/>
-      <w:r>
+        <w:rPr>
+          <w:lang w:val="sv-SE"/>
+        </w:rPr>
+        <w:t xml:space="preserve"> </w:t>
+      </w:r>
+      <w:proofErr w:type="spellStart"/>
+      <w:r>
+        <w:rPr>
+          <w:lang w:val="sv-SE"/>
+        </w:rPr>
+        <w:t>akademik</w:t>
+      </w:r>
+      <w:proofErr w:type="spellEnd"/>
+      <w:r>
+        <w:rPr>
+          <w:lang w:val="sv-SE"/>
+        </w:rPr>
+        <w:t xml:space="preserve">. </w:t>
+      </w:r>
+      <w:proofErr w:type="spellStart"/>
+      <w:r>
+        <w:rPr>
+          <w:lang w:val="sv-SE"/>
+        </w:rPr>
+        <w:t>Alasan</w:t>
+      </w:r>
+      <w:proofErr w:type="spellEnd"/>
+      <w:r>
+        <w:rPr>
+          <w:lang w:val="sv-SE"/>
+        </w:rPr>
+        <w:t xml:space="preserve"> </w:t>
+      </w:r>
+      <w:proofErr w:type="spellStart"/>
+      <w:r>
+        <w:rPr>
+          <w:lang w:val="sv-SE"/>
+        </w:rPr>
+        <w:t>utamanya</w:t>
+      </w:r>
+      <w:proofErr w:type="spellEnd"/>
+      <w:r>
+        <w:rPr>
+          <w:lang w:val="sv-SE"/>
+        </w:rPr>
+        <w:t xml:space="preserve"> </w:t>
+      </w:r>
+      <w:proofErr w:type="spellStart"/>
+      <w:r>
+        <w:rPr>
+          <w:lang w:val="sv-SE"/>
+        </w:rPr>
+        <w:t>adalah</w:t>
+      </w:r>
+      <w:proofErr w:type="spellEnd"/>
+      <w:r>
+        <w:rPr>
+          <w:lang w:val="sv-SE"/>
+        </w:rPr>
+        <w:t xml:space="preserve"> </w:t>
+      </w:r>
+      <w:proofErr w:type="spellStart"/>
+      <w:r>
+        <w:rPr>
+          <w:lang w:val="sv-SE"/>
+        </w:rPr>
+        <w:t>ketakutan</w:t>
+      </w:r>
+      <w:proofErr w:type="spellEnd"/>
+      <w:r>
+        <w:rPr>
+          <w:lang w:val="sv-SE"/>
+        </w:rPr>
+        <w:t xml:space="preserve"> </w:t>
+      </w:r>
+      <w:proofErr w:type="spellStart"/>
+      <w:r>
+        <w:rPr>
+          <w:lang w:val="sv-SE"/>
+        </w:rPr>
+        <w:t>gagal</w:t>
+      </w:r>
+      <w:proofErr w:type="spellEnd"/>
+      <w:r>
+        <w:rPr>
+          <w:lang w:val="sv-SE"/>
+        </w:rPr>
+        <w:t xml:space="preserve"> dan </w:t>
+      </w:r>
+      <w:proofErr w:type="spellStart"/>
+      <w:r>
+        <w:rPr>
+          <w:lang w:val="sv-SE"/>
+        </w:rPr>
+        <w:t>aversivitas</w:t>
+      </w:r>
+      <w:proofErr w:type="spellEnd"/>
+      <w:r>
+        <w:rPr>
+          <w:lang w:val="sv-SE"/>
+        </w:rPr>
+        <w:t xml:space="preserve"> </w:t>
+      </w:r>
+      <w:proofErr w:type="spellStart"/>
+      <w:r>
+        <w:rPr>
+          <w:lang w:val="sv-SE"/>
+        </w:rPr>
+        <w:t>tugas</w:t>
+      </w:r>
+      <w:proofErr w:type="spellEnd"/>
+      <w:r>
+        <w:rPr>
+          <w:lang w:val="sv-SE"/>
+        </w:rPr>
+        <w:t xml:space="preserve">. </w:t>
+      </w:r>
+      <w:proofErr w:type="spellStart"/>
+      <w:r>
+        <w:rPr>
+          <w:lang w:val="sv-SE"/>
+        </w:rPr>
+        <w:t>Prokrastinasi</w:t>
+      </w:r>
+      <w:proofErr w:type="spellEnd"/>
+      <w:r>
+        <w:rPr>
+          <w:lang w:val="sv-SE"/>
+        </w:rPr>
+        <w:t xml:space="preserve"> </w:t>
+      </w:r>
+      <w:proofErr w:type="spellStart"/>
+      <w:r>
+        <w:rPr>
+          <w:lang w:val="sv-SE"/>
+        </w:rPr>
+        <w:t>bukan</w:t>
+      </w:r>
+      <w:proofErr w:type="spellEnd"/>
+      <w:r>
+        <w:rPr>
+          <w:lang w:val="sv-SE"/>
+        </w:rPr>
+        <w:t xml:space="preserve"> </w:t>
+      </w:r>
+      <w:proofErr w:type="spellStart"/>
+      <w:r>
+        <w:rPr>
+          <w:lang w:val="sv-SE"/>
+        </w:rPr>
+        <w:t>sekadar</w:t>
+      </w:r>
+      <w:proofErr w:type="spellEnd"/>
+      <w:r>
+        <w:rPr>
+          <w:lang w:val="sv-SE"/>
+        </w:rPr>
+        <w:t xml:space="preserve"> </w:t>
+      </w:r>
+      <w:proofErr w:type="spellStart"/>
+      <w:r>
+        <w:rPr>
+          <w:lang w:val="sv-SE"/>
+        </w:rPr>
+        <w:t>kebiasaan</w:t>
+      </w:r>
+      <w:proofErr w:type="spellEnd"/>
+      <w:r>
+        <w:rPr>
+          <w:lang w:val="sv-SE"/>
+        </w:rPr>
+        <w:t xml:space="preserve"> </w:t>
+      </w:r>
+      <w:proofErr w:type="spellStart"/>
+      <w:r>
+        <w:rPr>
+          <w:lang w:val="sv-SE"/>
+        </w:rPr>
+        <w:t>belajar</w:t>
+      </w:r>
+      <w:proofErr w:type="spellEnd"/>
+      <w:r>
+        <w:rPr>
+          <w:lang w:val="sv-SE"/>
+        </w:rPr>
+        <w:t xml:space="preserve"> </w:t>
+      </w:r>
+      <w:proofErr w:type="spellStart"/>
+      <w:r>
+        <w:rPr>
+          <w:lang w:val="sv-SE"/>
+        </w:rPr>
+        <w:t>atau</w:t>
+      </w:r>
+      <w:proofErr w:type="spellEnd"/>
+      <w:r>
+        <w:rPr>
+          <w:lang w:val="sv-SE"/>
+        </w:rPr>
+        <w:t xml:space="preserve"> </w:t>
+      </w:r>
+      <w:proofErr w:type="spellStart"/>
+      <w:r>
+        <w:rPr>
+          <w:lang w:val="sv-SE"/>
+        </w:rPr>
+        <w:t>manajemen</w:t>
+      </w:r>
+      <w:proofErr w:type="spellEnd"/>
+      <w:r>
+        <w:rPr>
+          <w:lang w:val="sv-SE"/>
+        </w:rPr>
+        <w:t xml:space="preserve"> </w:t>
+      </w:r>
+      <w:proofErr w:type="spellStart"/>
+      <w:r>
+        <w:rPr>
+          <w:lang w:val="sv-SE"/>
+        </w:rPr>
+        <w:t>waktu</w:t>
+      </w:r>
+      <w:proofErr w:type="spellEnd"/>
+      <w:r>
+        <w:rPr>
+          <w:lang w:val="sv-SE"/>
+        </w:rPr>
+        <w:t xml:space="preserve"> yang </w:t>
+      </w:r>
+      <w:proofErr w:type="spellStart"/>
+      <w:r>
+        <w:rPr>
+          <w:lang w:val="sv-SE"/>
+        </w:rPr>
+        <w:t>buruk</w:t>
+      </w:r>
+      <w:proofErr w:type="spellEnd"/>
+      <w:r>
+        <w:rPr>
+          <w:lang w:val="sv-SE"/>
+        </w:rPr>
+        <w:t xml:space="preserve">, </w:t>
+      </w:r>
+      <w:proofErr w:type="spellStart"/>
+      <w:r>
+        <w:rPr>
+          <w:lang w:val="sv-SE"/>
+        </w:rPr>
+        <w:t>melainkan</w:t>
+      </w:r>
+      <w:proofErr w:type="spellEnd"/>
+      <w:r>
+        <w:rPr>
+          <w:lang w:val="sv-SE"/>
+        </w:rPr>
+        <w:t xml:space="preserve"> </w:t>
+      </w:r>
+      <w:proofErr w:type="spellStart"/>
+      <w:r>
+        <w:rPr>
+          <w:lang w:val="sv-SE"/>
+        </w:rPr>
+        <w:t>melibatkan</w:t>
+      </w:r>
+      <w:proofErr w:type="spellEnd"/>
+      <w:r>
+        <w:rPr>
+          <w:lang w:val="sv-SE"/>
+        </w:rPr>
+        <w:t xml:space="preserve"> </w:t>
+      </w:r>
+      <w:proofErr w:type="spellStart"/>
+      <w:r>
+        <w:rPr>
+          <w:lang w:val="sv-SE"/>
+        </w:rPr>
+        <w:t>komponen</w:t>
+      </w:r>
+      <w:proofErr w:type="spellEnd"/>
+      <w:r>
+        <w:rPr>
+          <w:lang w:val="sv-SE"/>
+        </w:rPr>
+        <w:t xml:space="preserve"> </w:t>
+      </w:r>
+      <w:proofErr w:type="spellStart"/>
+      <w:r>
+        <w:rPr>
+          <w:lang w:val="sv-SE"/>
+        </w:rPr>
+        <w:t>perilaku</w:t>
+      </w:r>
+      <w:proofErr w:type="spellEnd"/>
+      <w:r>
+        <w:rPr>
+          <w:lang w:val="sv-SE"/>
+        </w:rPr>
+        <w:t xml:space="preserve">, </w:t>
+      </w:r>
+      <w:proofErr w:type="spellStart"/>
+      <w:r>
+        <w:rPr>
+          <w:lang w:val="sv-SE"/>
+        </w:rPr>
+        <w:t>kognitif</w:t>
+      </w:r>
+      <w:proofErr w:type="spellEnd"/>
+      <w:r>
+        <w:rPr>
+          <w:lang w:val="sv-SE"/>
+        </w:rPr>
+        <w:t xml:space="preserve">, dan </w:t>
+      </w:r>
+      <w:proofErr w:type="spellStart"/>
+      <w:r>
+        <w:rPr>
+          <w:lang w:val="sv-SE"/>
+        </w:rPr>
+        <w:t>afektif</w:t>
+      </w:r>
+      <w:proofErr w:type="spellEnd"/>
+      <w:r>
+        <w:rPr>
+          <w:lang w:val="sv-SE"/>
+        </w:rPr>
         <w:t>.</w:t>
+      </w:r>
+      <w:r>
+        <w:rPr>
+          <w:b/>
+          <w:bCs/>
+          <w:lang w:val="sv-SE"/>
+        </w:rPr>
+        <w:t xml:space="preserve"> </w:t>
       </w:r>
     </w:p>
     <w:p>
@@ -5737,176 +6496,285 @@
         </w:numPr>
         <w:spacing w:after="80" w:line="276" w:lineRule="auto"/>
         <w:jc w:val="both"/>
+        <w:rPr>
+          <w:lang w:val="sv-SE"/>
+        </w:rPr>
       </w:pPr>
+      <w:proofErr w:type="spellStart"/>
       <w:r>
         <w:rPr>
           <w:b/>
           <w:bCs/>
-        </w:rPr>
-        <w:t xml:space="preserve">Stanford </w:t>
-      </w:r>
-      <w:proofErr w:type="spellStart"/>
-      <w:proofErr w:type="gramStart"/>
+          <w:lang w:val="sv-SE"/>
+        </w:rPr>
+        <w:t>Gollwitzer</w:t>
+      </w:r>
+      <w:proofErr w:type="spellEnd"/>
       <w:r>
         <w:rPr>
           <w:b/>
           <w:bCs/>
-        </w:rPr>
-        <w:t>d.school</w:t>
-      </w:r>
-      <w:proofErr w:type="spellEnd"/>
-      <w:proofErr w:type="gramEnd"/>
+          <w:lang w:val="sv-SE"/>
+        </w:rPr>
+        <w:t xml:space="preserve"> &amp; Sheeran (2006), </w:t>
+      </w:r>
+      <w:proofErr w:type="spellStart"/>
       <w:r>
         <w:rPr>
           <w:b/>
           <w:bCs/>
-        </w:rPr>
-        <w:t xml:space="preserve"> Research:</w:t>
-      </w:r>
-      <w:r>
-        <w:t xml:space="preserve"> </w:t>
-      </w:r>
-      <w:proofErr w:type="spellStart"/>
-      <w:r>
-        <w:t>Prinsip</w:t>
-      </w:r>
-      <w:proofErr w:type="spellEnd"/>
-      <w:r>
-        <w:t xml:space="preserve"> </w:t>
-      </w:r>
-      <w:r>
-        <w:rPr>
-          <w:i/>
-          <w:iCs/>
-        </w:rPr>
-        <w:t>Micro-Commitment</w:t>
-      </w:r>
-      <w:r>
-        <w:t xml:space="preserve"> (</w:t>
-      </w:r>
-      <w:proofErr w:type="spellStart"/>
-      <w:r>
+          <w:i/>
+          <w:iCs/>
+          <w:lang w:val="sv-SE"/>
+        </w:rPr>
+        <w:t>Advances</w:t>
+      </w:r>
+      <w:proofErr w:type="spellEnd"/>
+      <w:r>
+        <w:rPr>
+          <w:b/>
+          <w:bCs/>
+          <w:i/>
+          <w:iCs/>
+          <w:lang w:val="sv-SE"/>
+        </w:rPr>
+        <w:t xml:space="preserve"> in Experimental Social </w:t>
+      </w:r>
+      <w:proofErr w:type="spellStart"/>
+      <w:r>
+        <w:rPr>
+          <w:b/>
+          <w:bCs/>
+          <w:i/>
+          <w:iCs/>
+          <w:lang w:val="sv-SE"/>
+        </w:rPr>
+        <w:t>Psychology</w:t>
+      </w:r>
+      <w:proofErr w:type="spellEnd"/>
+      <w:r>
+        <w:rPr>
+          <w:b/>
+          <w:bCs/>
+          <w:lang w:val="sv-SE"/>
+        </w:rPr>
+        <w:t>:</w:t>
+      </w:r>
+      <w:r>
+        <w:rPr>
+          <w:lang w:val="sv-SE"/>
+        </w:rPr>
+        <w:t xml:space="preserve"> Meta-</w:t>
+      </w:r>
+      <w:proofErr w:type="spellStart"/>
+      <w:r>
+        <w:rPr>
+          <w:lang w:val="sv-SE"/>
+        </w:rPr>
+        <w:t>analisis</w:t>
+      </w:r>
+      <w:proofErr w:type="spellEnd"/>
+      <w:r>
+        <w:rPr>
+          <w:lang w:val="sv-SE"/>
+        </w:rPr>
+        <w:t xml:space="preserve"> 94 tes </w:t>
+      </w:r>
+      <w:proofErr w:type="spellStart"/>
+      <w:r>
+        <w:rPr>
+          <w:lang w:val="sv-SE"/>
+        </w:rPr>
+        <w:t>menunjukkan</w:t>
+      </w:r>
+      <w:proofErr w:type="spellEnd"/>
+      <w:r>
+        <w:rPr>
+          <w:lang w:val="sv-SE"/>
+        </w:rPr>
+        <w:t xml:space="preserve"> </w:t>
+      </w:r>
+      <w:proofErr w:type="spellStart"/>
+      <w:r>
+        <w:rPr>
+          <w:lang w:val="sv-SE"/>
+        </w:rPr>
+        <w:t>rencana</w:t>
+      </w:r>
+      <w:proofErr w:type="spellEnd"/>
+      <w:r>
+        <w:rPr>
+          <w:lang w:val="sv-SE"/>
+        </w:rPr>
+        <w:t xml:space="preserve"> "</w:t>
+      </w:r>
+      <w:proofErr w:type="spellStart"/>
+      <w:r>
+        <w:rPr>
+          <w:lang w:val="sv-SE"/>
+        </w:rPr>
+        <w:t>jika</w:t>
+      </w:r>
+      <w:proofErr w:type="spellEnd"/>
+      <w:r>
+        <w:rPr>
+          <w:lang w:val="sv-SE"/>
+        </w:rPr>
+        <w:t xml:space="preserve"> </w:t>
+      </w:r>
+      <w:proofErr w:type="spellStart"/>
+      <w:r>
+        <w:rPr>
+          <w:lang w:val="sv-SE"/>
+        </w:rPr>
+        <w:t>situasi</w:t>
+      </w:r>
+      <w:proofErr w:type="spellEnd"/>
+      <w:r>
+        <w:rPr>
+          <w:lang w:val="sv-SE"/>
+        </w:rPr>
+        <w:t xml:space="preserve"> X, maka </w:t>
+      </w:r>
+      <w:proofErr w:type="spellStart"/>
+      <w:r>
+        <w:rPr>
+          <w:lang w:val="sv-SE"/>
+        </w:rPr>
+        <w:t>saya</w:t>
+      </w:r>
+      <w:proofErr w:type="spellEnd"/>
+      <w:r>
+        <w:rPr>
+          <w:lang w:val="sv-SE"/>
+        </w:rPr>
+        <w:t xml:space="preserve"> </w:t>
+      </w:r>
+      <w:proofErr w:type="spellStart"/>
+      <w:r>
+        <w:rPr>
+          <w:lang w:val="sv-SE"/>
+        </w:rPr>
+        <w:t>lakukan</w:t>
+      </w:r>
+      <w:proofErr w:type="spellEnd"/>
+      <w:r>
+        <w:rPr>
+          <w:lang w:val="sv-SE"/>
+        </w:rPr>
+        <w:t xml:space="preserve"> Y" </w:t>
+      </w:r>
+      <w:proofErr w:type="spellStart"/>
+      <w:r>
+        <w:rPr>
+          <w:lang w:val="sv-SE"/>
+        </w:rPr>
+        <w:t>berpengaruh</w:t>
+      </w:r>
+      <w:proofErr w:type="spellEnd"/>
+      <w:r>
+        <w:rPr>
+          <w:lang w:val="sv-SE"/>
+        </w:rPr>
+        <w:t xml:space="preserve"> </w:t>
+      </w:r>
+      <w:proofErr w:type="spellStart"/>
+      <w:r>
+        <w:rPr>
+          <w:lang w:val="sv-SE"/>
+        </w:rPr>
+        <w:t>sedang-besar</w:t>
+      </w:r>
+      <w:proofErr w:type="spellEnd"/>
+      <w:r>
+        <w:rPr>
+          <w:lang w:val="sv-SE"/>
+        </w:rPr>
+        <w:t xml:space="preserve"> (d = .65) </w:t>
+      </w:r>
+      <w:proofErr w:type="spellStart"/>
+      <w:r>
+        <w:rPr>
+          <w:lang w:val="sv-SE"/>
+        </w:rPr>
+        <w:t>pada</w:t>
+      </w:r>
+      <w:proofErr w:type="spellEnd"/>
+      <w:r>
+        <w:rPr>
+          <w:lang w:val="sv-SE"/>
+        </w:rPr>
+        <w:t xml:space="preserve"> </w:t>
+      </w:r>
+      <w:proofErr w:type="spellStart"/>
+      <w:r>
+        <w:rPr>
+          <w:lang w:val="sv-SE"/>
+        </w:rPr>
+        <w:t>pencapaian</w:t>
+      </w:r>
+      <w:proofErr w:type="spellEnd"/>
+      <w:r>
+        <w:rPr>
+          <w:lang w:val="sv-SE"/>
+        </w:rPr>
+        <w:t xml:space="preserve"> </w:t>
+      </w:r>
+      <w:proofErr w:type="spellStart"/>
+      <w:r>
+        <w:rPr>
+          <w:lang w:val="sv-SE"/>
+        </w:rPr>
+        <w:t>tujuan</w:t>
+      </w:r>
+      <w:proofErr w:type="spellEnd"/>
+      <w:r>
+        <w:rPr>
+          <w:lang w:val="sv-SE"/>
+        </w:rPr>
+        <w:t xml:space="preserve">, </w:t>
+      </w:r>
+      <w:proofErr w:type="spellStart"/>
+      <w:r>
+        <w:rPr>
+          <w:lang w:val="sv-SE"/>
+        </w:rPr>
+        <w:t>termasuk</w:t>
+      </w:r>
+      <w:proofErr w:type="spellEnd"/>
+      <w:r>
+        <w:rPr>
+          <w:lang w:val="sv-SE"/>
+        </w:rPr>
+        <w:t xml:space="preserve"> membantu </w:t>
+      </w:r>
+      <w:proofErr w:type="spellStart"/>
+      <w:r>
+        <w:rPr>
+          <w:lang w:val="sv-SE"/>
+        </w:rPr>
+        <w:t>memulai</w:t>
+      </w:r>
+      <w:proofErr w:type="spellEnd"/>
+      <w:r>
+        <w:rPr>
+          <w:lang w:val="sv-SE"/>
+        </w:rPr>
+        <w:t xml:space="preserve"> </w:t>
+      </w:r>
+      <w:proofErr w:type="spellStart"/>
+      <w:r>
+        <w:rPr>
+          <w:lang w:val="sv-SE"/>
+        </w:rPr>
         <w:t>tindakan</w:t>
       </w:r>
       <w:proofErr w:type="spellEnd"/>
       <w:r>
-        <w:t xml:space="preserve"> </w:t>
-      </w:r>
-      <w:proofErr w:type="spellStart"/>
-      <w:r>
-        <w:t>mikro</w:t>
-      </w:r>
-      <w:proofErr w:type="spellEnd"/>
-      <w:r>
-        <w:t xml:space="preserve"> </w:t>
-      </w:r>
-      <w:proofErr w:type="spellStart"/>
-      <w:r>
-        <w:t>berdurasi</w:t>
-      </w:r>
-      <w:proofErr w:type="spellEnd"/>
-      <w:r>
-        <w:t xml:space="preserve"> 25–45 </w:t>
-      </w:r>
-      <w:proofErr w:type="spellStart"/>
-      <w:r>
-        <w:t>menit</w:t>
-      </w:r>
-      <w:proofErr w:type="spellEnd"/>
-      <w:r>
-        <w:t xml:space="preserve">) </w:t>
-      </w:r>
-      <w:proofErr w:type="spellStart"/>
-      <w:r>
-        <w:t>menurunkan</w:t>
-      </w:r>
-      <w:proofErr w:type="spellEnd"/>
-      <w:r>
-        <w:t xml:space="preserve"> </w:t>
-      </w:r>
-      <w:proofErr w:type="spellStart"/>
-      <w:r>
-        <w:t>kecemasan</w:t>
-      </w:r>
-      <w:proofErr w:type="spellEnd"/>
-      <w:r>
-        <w:t xml:space="preserve"> </w:t>
-      </w:r>
-      <w:proofErr w:type="spellStart"/>
-      <w:r>
-        <w:t>kerja</w:t>
-      </w:r>
-      <w:proofErr w:type="spellEnd"/>
-      <w:r>
-        <w:t xml:space="preserve"> (</w:t>
-      </w:r>
-      <w:r>
-        <w:rPr>
-          <w:i/>
-          <w:iCs/>
-        </w:rPr>
-        <w:t>task anxiety</w:t>
-      </w:r>
-      <w:r>
-        <w:t xml:space="preserve">) </w:t>
-      </w:r>
-      <w:proofErr w:type="spellStart"/>
-      <w:r>
-        <w:t>secara</w:t>
-      </w:r>
-      <w:proofErr w:type="spellEnd"/>
-      <w:r>
-        <w:t xml:space="preserve"> </w:t>
-      </w:r>
-      <w:proofErr w:type="spellStart"/>
-      <w:r>
-        <w:t>drastis</w:t>
-      </w:r>
-      <w:proofErr w:type="spellEnd"/>
-      <w:r>
-        <w:t xml:space="preserve"> </w:t>
-      </w:r>
-      <w:proofErr w:type="spellStart"/>
-      <w:r>
-        <w:t>serta</w:t>
-      </w:r>
-      <w:proofErr w:type="spellEnd"/>
-      <w:r>
-        <w:t xml:space="preserve"> </w:t>
-      </w:r>
-      <w:proofErr w:type="spellStart"/>
-      <w:r>
-        <w:t>membangun</w:t>
-      </w:r>
-      <w:proofErr w:type="spellEnd"/>
-      <w:r>
-        <w:t xml:space="preserve"> momentum </w:t>
-      </w:r>
-      <w:proofErr w:type="spellStart"/>
-      <w:r>
-        <w:t>penyelesaian</w:t>
-      </w:r>
-      <w:proofErr w:type="spellEnd"/>
-      <w:r>
-        <w:t xml:space="preserve"> </w:t>
-      </w:r>
-      <w:proofErr w:type="spellStart"/>
-      <w:r>
-        <w:t>berkelanjutan</w:t>
-      </w:r>
-      <w:proofErr w:type="spellEnd"/>
-      <w:r>
-        <w:t xml:space="preserve"> (</w:t>
-      </w:r>
-      <w:r>
-        <w:rPr>
-          <w:i/>
-          <w:iCs/>
-        </w:rPr>
-        <w:t>action momentum</w:t>
-      </w:r>
-      <w:r>
-        <w:t>).</w:t>
+        <w:rPr>
+          <w:lang w:val="sv-SE"/>
+        </w:rPr>
+        <w:t>.</w:t>
       </w:r>
     </w:p>
     <w:p>
@@ -9283,6 +10151,7 @@
     <w:p>
       <w:pPr>
         <w:pStyle w:val="Heading1"/>
+        <w:jc w:val="center"/>
         <w:rPr>
           <w:lang w:val="sv-SE"/>
         </w:rPr>
@@ -9292,9 +10161,9 @@
           <w:noProof/>
         </w:rPr>
         <w:drawing>
-          <wp:inline distT="0" distB="0" distL="0" distR="0" wp14:anchorId="3662B659" wp14:editId="5E7EA2C2">
-            <wp:extent cx="5593624" cy="4086665"/>
-            <wp:effectExtent l="0" t="0" r="7620" b="9525"/>
+          <wp:inline distT="0" distB="0" distL="0" distR="0" wp14:anchorId="3662B659" wp14:editId="59F9D895">
+            <wp:extent cx="4016164" cy="2934182"/>
+            <wp:effectExtent l="0" t="0" r="3810" b="0"/>
             <wp:docPr id="1760780876" name="Picture 5"/>
             <wp:cNvGraphicFramePr>
               <a:graphicFrameLocks xmlns:a="http://schemas.openxmlformats.org/drawingml/2006/main" noChangeAspect="1"/>
@@ -9309,7 +10178,7 @@
                     </pic:cNvPicPr>
                   </pic:nvPicPr>
                   <pic:blipFill>
-                    <a:blip r:embed="rId10" cstate="print">
+                    <a:blip r:embed="rId12" cstate="print">
                       <a:extLst>
                         <a:ext uri="{28A0092B-C50C-407E-A947-70E740481C1C}">
                           <a14:useLocalDpi xmlns:a14="http://schemas.microsoft.com/office/drawing/2010/main" val="0"/>
@@ -9324,7 +10193,7 @@
                   <pic:spPr bwMode="auto">
                     <a:xfrm>
                       <a:off x="0" y="0"/>
-                      <a:ext cx="5611303" cy="4099581"/>
+                      <a:ext cx="4037832" cy="2950013"/>
                     </a:xfrm>
                     <a:prstGeom prst="rect">
                       <a:avLst/>
@@ -12569,24 +13438,6 @@
     </w:p>
     <w:p>
       <w:pPr>
-        <w:spacing w:after="80" w:line="276" w:lineRule="auto"/>
-        <w:jc w:val="both"/>
-        <w:rPr>
-          <w:lang w:val="sv-SE"/>
-        </w:rPr>
-      </w:pPr>
-    </w:p>
-    <w:p>
-      <w:pPr>
-        <w:spacing w:after="80" w:line="276" w:lineRule="auto"/>
-        <w:jc w:val="both"/>
-        <w:rPr>
-          <w:lang w:val="sv-SE"/>
-        </w:rPr>
-      </w:pPr>
-    </w:p>
-    <w:p>
-      <w:pPr>
         <w:pStyle w:val="Heading2"/>
         <w:keepNext/>
         <w:spacing w:line="276" w:lineRule="auto"/>
@@ -13091,15 +13942,15 @@
         <w:pStyle w:val="ListParagraph"/>
         <w:spacing w:after="80" w:line="276" w:lineRule="auto"/>
         <w:ind w:left="720"/>
-        <w:jc w:val="both"/>
+        <w:jc w:val="center"/>
       </w:pPr>
       <w:r>
         <w:rPr>
           <w:noProof/>
         </w:rPr>
         <w:drawing>
-          <wp:inline distT="0" distB="0" distL="0" distR="0" wp14:anchorId="771A222E" wp14:editId="2B00A649">
-            <wp:extent cx="5037140" cy="2692937"/>
+          <wp:inline distT="0" distB="0" distL="0" distR="0" wp14:anchorId="771A222E" wp14:editId="70389987">
+            <wp:extent cx="5109506" cy="2731625"/>
             <wp:effectExtent l="0" t="0" r="0" b="0"/>
             <wp:docPr id="1427298298" name="Picture 6"/>
             <wp:cNvGraphicFramePr>
@@ -13115,7 +13966,7 @@
                     </pic:cNvPicPr>
                   </pic:nvPicPr>
                   <pic:blipFill>
-                    <a:blip r:embed="rId11" cstate="print">
+                    <a:blip r:embed="rId13" cstate="print">
                       <a:extLst>
                         <a:ext uri="{28A0092B-C50C-407E-A947-70E740481C1C}">
                           <a14:useLocalDpi xmlns:a14="http://schemas.microsoft.com/office/drawing/2010/main" val="0"/>
@@ -13130,7 +13981,7 @@
                   <pic:spPr bwMode="auto">
                     <a:xfrm>
                       <a:off x="0" y="0"/>
-                      <a:ext cx="5040448" cy="2694705"/>
+                      <a:ext cx="5119072" cy="2736739"/>
                     </a:xfrm>
                     <a:prstGeom prst="rect">
                       <a:avLst/>
@@ -14816,7 +15667,7 @@
       </w:r>
     </w:p>
     <w:sectPr>
-      <w:footerReference w:type="default" r:id="rId12"/>
+      <w:footerReference w:type="default" r:id="rId14"/>
       <w:pgSz w:w="11906" w:h="16838"/>
       <w:pgMar w:top="1417" w:right="1417" w:bottom="1417" w:left="1701" w:header="708" w:footer="708" w:gutter="0"/>
       <w:pgNumType w:start="1"/>
@@ -15811,7 +16662,6 @@
   <w:style w:type="character" w:default="1" w:styleId="DefaultParagraphFont">
     <w:name w:val="Default Paragraph Font"/>
     <w:uiPriority w:val="1"/>
-    <w:semiHidden/>
     <w:unhideWhenUsed/>
   </w:style>
   <w:style w:type="table" w:default="1" w:styleId="TableNormal">
@@ -15937,6 +16787,30 @@
       <w:b/>
       <w:bCs/>
       <w:color w:val="000000"/>
+    </w:rPr>
+  </w:style>
+  <w:style w:type="character" w:styleId="UnresolvedMention">
+    <w:name w:val="Unresolved Mention"/>
+    <w:basedOn w:val="DefaultParagraphFont"/>
+    <w:uiPriority w:val="99"/>
+    <w:semiHidden/>
+    <w:unhideWhenUsed/>
+    <w:rsid w:val="003466E4"/>
+    <w:rPr>
+      <w:color w:val="605E5C"/>
+      <w:shd w:val="clear" w:color="auto" w:fill="E1DFDD"/>
+    </w:rPr>
+  </w:style>
+  <w:style w:type="character" w:styleId="FollowedHyperlink">
+    <w:name w:val="FollowedHyperlink"/>
+    <w:basedOn w:val="DefaultParagraphFont"/>
+    <w:uiPriority w:val="99"/>
+    <w:semiHidden/>
+    <w:unhideWhenUsed/>
+    <w:rsid w:val="00C277FB"/>
+    <w:rPr>
+      <w:color w:val="954F72" w:themeColor="followedHyperlink"/>
+      <w:u w:val="single"/>
     </w:rPr>
   </w:style>
 </w:styles>

</xml_diff>